<commit_message>
Melhora quadro de assinaturas do termo
</commit_message>
<xml_diff>
--- a/models/termo-compromisso-estagio-obrigatorio-aems.docx
+++ b/models/termo-compromisso-estagio-obrigatorio-aems.docx
@@ -3707,100 +3707,42 @@
       <w:tr ns2:paraId="24D1A5F7" ns2:textId="77777777">
         <w:trPr>
           <w:trHeight w:val="1579"/>
+          <w:cantSplit/>
         </w:trPr>
         <w:tc>
           <w:tcPr>
             <w:tcW w:w="5398" w:type="dxa"/>
+            <w:vAlign w:val="center"/>
+            <w:tcMar>
+              <w:top w:w="120" w:type="dxa"/>
+              <w:start w:w="120" w:type="dxa"/>
+              <w:bottom w:w="120" w:type="dxa"/>
+              <w:end w:w="120" w:type="dxa"/>
+            </w:tcMar>
           </w:tcPr>
-          <w:p ns2:paraId="274F24C4" ns2:textId="77777777">
+          <w:p>
             <w:pPr>
-              <w:tabs>
-                <w:tab w:val="left" w:pos="0"/>
-              </w:tabs>
-              <w:spacing w:before="0" w:after="0" w:line="240" w:lineRule="auto"/>
-              <w:rPr>
-                <w:rFonts w:ascii="Arial" w:hAnsi="Arial" w:cs="Arial"/>
-                <w:b/>
-                <w:sz w:val="24"/>
-                <w:szCs w:val="24"/>
-              </w:rPr>
-            </w:pPr>
-          </w:p>
-          <w:p ns2:paraId="22423285" ns2:textId="77777777">
-            <w:pPr>
-              <w:tabs>
-                <w:tab w:val="left" w:pos="0"/>
-              </w:tabs>
-              <w:spacing w:before="0" w:after="0" w:line="240" w:lineRule="auto"/>
-              <w:rPr>
-                <w:rFonts w:ascii="Arial" w:hAnsi="Arial" w:cs="Arial"/>
-                <w:b/>
-                <w:sz w:val="24"/>
-                <w:szCs w:val="24"/>
-              </w:rPr>
-            </w:pPr>
-          </w:p>
-          <w:p ns2:paraId="6098ECD5" ns2:textId="77777777">
-            <w:pPr>
-              <w:tabs>
-                <w:tab w:val="left" w:pos="0"/>
-              </w:tabs>
-              <w:spacing w:before="0" w:after="0" w:line="240" w:lineRule="auto"/>
-              <w:rPr>
-                <w:rFonts w:ascii="Arial" w:hAnsi="Arial" w:cs="Arial"/>
-                <w:b/>
-                <w:sz w:val="24"/>
-                <w:szCs w:val="24"/>
-              </w:rPr>
-            </w:pPr>
-          </w:p>
-          <w:p ns2:paraId="65C2A362" ns2:textId="77777777">
-            <w:pPr>
-              <w:tabs>
-                <w:tab w:val="left" w:pos="0"/>
-              </w:tabs>
-              <w:spacing w:before="0" w:after="0" w:line="240" w:lineRule="auto"/>
-              <w:rPr>
-                <w:rFonts w:ascii="Arial" w:hAnsi="Arial" w:cs="Arial"/>
-                <w:b/>
-                <w:sz w:val="24"/>
-                <w:szCs w:val="24"/>
-              </w:rPr>
-            </w:pPr>
-          </w:p>
-          <w:p ns2:paraId="7702D80A" ns2:textId="77777777">
-            <w:pPr>
-              <w:tabs>
-                <w:tab w:val="left" w:pos="0"/>
-              </w:tabs>
-              <w:spacing w:before="0" w:after="0" w:line="240" w:lineRule="auto"/>
-              <w:rPr>
-                <w:rFonts w:ascii="Arial" w:hAnsi="Arial" w:cs="Arial"/>
-                <w:b/>
-                <w:sz w:val="24"/>
-                <w:szCs w:val="24"/>
-              </w:rPr>
-            </w:pPr>
-          </w:p>
-          <w:p ns2:paraId="4326F7FC" ns2:textId="77777777">
-            <w:pPr>
-              <w:tabs>
-                <w:tab w:val="left" w:pos="0"/>
-              </w:tabs>
-              <w:spacing w:before="0" w:after="0" w:line="240" w:lineRule="auto"/>
-              <w:rPr>
-                <w:rFonts w:ascii="Arial" w:hAnsi="Arial" w:cs="Arial"/>
-                <w:b/>
-                <w:sz w:val="24"/>
-                <w:szCs w:val="24"/>
-              </w:rPr>
+              <w:spacing w:before="0" w:after="40" w:line="240" w:lineRule="auto"/>
+              <w:jc w:val="left"/>
             </w:pPr>
             <w:r>
               <w:rPr>
-                <w:rFonts w:ascii="Arial" w:hAnsi="Arial" w:cs="Arial"/>
+                <w:rFonts w:ascii="Arial" w:hAnsi="Arial"/>
+                <w:sz w:val="20"/>
+              </w:rPr>
+              <w:t>______________________________</w:t>
+            </w:r>
+          </w:p>
+          <w:p>
+            <w:pPr>
+              <w:spacing w:before="0" w:after="0" w:line="240" w:lineRule="auto"/>
+              <w:jc w:val="left"/>
+            </w:pPr>
+            <w:r>
+              <w:rPr>
+                <w:rFonts w:ascii="Arial" w:hAnsi="Arial"/>
                 <w:b/>
-                <w:sz w:val="20"/>
-                <w:szCs w:val="24"/>
+                <w:sz w:val="19"/>
               </w:rPr>
               <w:t>Unidade Concedente do Estágio</w:t>
             </w:r>
@@ -3809,84 +3751,37 @@
         <w:tc>
           <w:tcPr>
             <w:tcW w:w="5398" w:type="dxa"/>
+            <w:vAlign w:val="center"/>
+            <w:tcMar>
+              <w:top w:w="120" w:type="dxa"/>
+              <w:start w:w="120" w:type="dxa"/>
+              <w:bottom w:w="120" w:type="dxa"/>
+              <w:end w:w="120" w:type="dxa"/>
+            </w:tcMar>
           </w:tcPr>
-          <w:p ns2:paraId="49045E3B" ns2:textId="77777777">
+          <w:p>
             <w:pPr>
-              <w:tabs>
-                <w:tab w:val="left" w:pos="0"/>
-                <w:tab w:val="left" w:pos="9639"/>
-              </w:tabs>
-              <w:spacing w:before="0" w:after="0" w:line="240" w:lineRule="auto"/>
-              <w:rPr>
-                <w:rFonts w:ascii="Arial" w:hAnsi="Arial" w:cs="Arial"/>
-                <w:sz w:val="24"/>
-                <w:szCs w:val="24"/>
-              </w:rPr>
-            </w:pPr>
-          </w:p>
-          <w:p ns2:paraId="479FD58D" ns2:textId="77777777">
-            <w:pPr>
-              <w:spacing w:before="0" w:after="0" w:line="240" w:lineRule="auto"/>
-              <w:rPr>
-                <w:rFonts w:ascii="Arial" w:hAnsi="Arial" w:cs="Arial"/>
-                <w:sz w:val="24"/>
-                <w:szCs w:val="24"/>
-              </w:rPr>
-            </w:pPr>
-          </w:p>
-          <w:p ns2:paraId="59D04D13" ns2:textId="77777777">
-            <w:pPr>
-              <w:spacing w:before="0" w:after="0" w:line="240" w:lineRule="auto"/>
-              <w:rPr>
-                <w:rFonts w:ascii="Arial" w:hAnsi="Arial" w:cs="Arial"/>
-                <w:sz w:val="24"/>
-                <w:szCs w:val="24"/>
-              </w:rPr>
-            </w:pPr>
-          </w:p>
-          <w:p ns2:paraId="2729BD5A" ns2:textId="77777777">
-            <w:pPr>
-              <w:spacing w:before="0" w:after="0" w:line="240" w:lineRule="auto"/>
-              <w:rPr>
-                <w:rFonts w:ascii="Arial" w:hAnsi="Arial" w:cs="Arial"/>
-                <w:sz w:val="24"/>
-                <w:szCs w:val="24"/>
-              </w:rPr>
-            </w:pPr>
-          </w:p>
-          <w:p ns2:paraId="0751EB4F" ns2:textId="77777777">
-            <w:pPr>
-              <w:tabs>
-                <w:tab w:val="left" w:pos="0"/>
-              </w:tabs>
-              <w:spacing w:before="0" w:after="0" w:line="240" w:lineRule="auto"/>
-              <w:rPr>
-                <w:rFonts w:ascii="Arial" w:hAnsi="Arial" w:cs="Arial"/>
-                <w:b/>
-                <w:sz w:val="24"/>
-                <w:szCs w:val="24"/>
-              </w:rPr>
-            </w:pPr>
-          </w:p>
-          <w:p ns2:paraId="6CBCDF5B" ns2:textId="77777777">
-            <w:pPr>
-              <w:tabs>
-                <w:tab w:val="left" w:pos="0"/>
-              </w:tabs>
-              <w:spacing w:before="0" w:after="0" w:line="240" w:lineRule="auto"/>
-              <w:rPr>
-                <w:rFonts w:ascii="Arial" w:hAnsi="Arial" w:cs="Arial"/>
-                <w:b/>
-                <w:sz w:val="24"/>
-                <w:szCs w:val="24"/>
-              </w:rPr>
+              <w:spacing w:before="0" w:after="40" w:line="240" w:lineRule="auto"/>
+              <w:jc w:val="left"/>
             </w:pPr>
             <w:r>
               <w:rPr>
-                <w:rFonts w:ascii="Arial" w:hAnsi="Arial" w:cs="Arial"/>
+                <w:rFonts w:ascii="Arial" w:hAnsi="Arial"/>
+                <w:sz w:val="20"/>
+              </w:rPr>
+              <w:t>______________________________</w:t>
+            </w:r>
+          </w:p>
+          <w:p>
+            <w:pPr>
+              <w:spacing w:before="0" w:after="0" w:line="240" w:lineRule="auto"/>
+              <w:jc w:val="left"/>
+            </w:pPr>
+            <w:r>
+              <w:rPr>
+                <w:rFonts w:ascii="Arial" w:hAnsi="Arial"/>
                 <w:b/>
-                <w:sz w:val="20"/>
-                <w:szCs w:val="24"/>
+                <w:sz w:val="19"/>
               </w:rPr>
               <w:t>Estagiário</w:t>
             </w:r>
@@ -3896,70 +3791,42 @@
       <w:tr ns2:paraId="470DB7EC" ns2:textId="77777777">
         <w:trPr>
           <w:trHeight w:val="1579"/>
+          <w:cantSplit/>
         </w:trPr>
         <w:tc>
           <w:tcPr>
             <w:tcW w:w="5398" w:type="dxa"/>
+            <w:vAlign w:val="center"/>
+            <w:tcMar>
+              <w:top w:w="120" w:type="dxa"/>
+              <w:start w:w="120" w:type="dxa"/>
+              <w:bottom w:w="120" w:type="dxa"/>
+              <w:end w:w="120" w:type="dxa"/>
+            </w:tcMar>
           </w:tcPr>
-          <w:p ns2:paraId="19D8AA9B" ns2:textId="77777777">
+          <w:p>
             <w:pPr>
-              <w:tabs>
-                <w:tab w:val="left" w:pos="0"/>
-                <w:tab w:val="left" w:pos="9639"/>
-              </w:tabs>
-              <w:spacing w:before="0" w:after="0" w:line="240" w:lineRule="auto"/>
-              <w:rPr>
-                <w:rFonts w:ascii="Arial" w:hAnsi="Arial" w:cs="Arial"/>
-                <w:sz w:val="24"/>
-                <w:szCs w:val="24"/>
-              </w:rPr>
-            </w:pPr>
-          </w:p>
-          <w:p ns2:paraId="2815C6CA" ns2:textId="77777777">
-            <w:pPr>
-              <w:spacing w:before="0" w:after="0" w:line="240" w:lineRule="auto"/>
-              <w:rPr>
-                <w:rFonts w:ascii="Arial" w:hAnsi="Arial" w:cs="Arial"/>
-                <w:sz w:val="24"/>
-                <w:szCs w:val="24"/>
-              </w:rPr>
-            </w:pPr>
-          </w:p>
-          <w:p ns2:paraId="6677FBFC" ns2:textId="77777777">
-            <w:pPr>
-              <w:spacing w:before="0" w:after="0" w:line="240" w:lineRule="auto"/>
-              <w:rPr>
-                <w:rFonts w:ascii="Arial" w:hAnsi="Arial" w:cs="Arial"/>
-                <w:sz w:val="24"/>
-                <w:szCs w:val="24"/>
-              </w:rPr>
-            </w:pPr>
-          </w:p>
-          <w:p ns2:paraId="240AF320" ns2:textId="77777777">
-            <w:pPr>
-              <w:spacing w:before="0" w:after="0" w:line="240" w:lineRule="auto"/>
-              <w:rPr>
-                <w:rFonts w:ascii="Arial" w:hAnsi="Arial" w:cs="Arial"/>
-                <w:sz w:val="24"/>
-                <w:szCs w:val="24"/>
-              </w:rPr>
-            </w:pPr>
-          </w:p>
-          <w:p ns2:paraId="531DE0C6" ns2:textId="77777777">
-            <w:pPr>
-              <w:spacing w:before="0" w:after="0" w:line="240" w:lineRule="auto"/>
-              <w:rPr>
-                <w:rFonts w:ascii="Arial" w:hAnsi="Arial" w:cs="Arial"/>
-                <w:sz w:val="24"/>
-                <w:szCs w:val="24"/>
-              </w:rPr>
+              <w:spacing w:before="0" w:after="40" w:line="240" w:lineRule="auto"/>
+              <w:jc w:val="left"/>
             </w:pPr>
             <w:r>
               <w:rPr>
-                <w:rFonts w:ascii="Arial" w:hAnsi="Arial" w:cs="Arial"/>
+                <w:rFonts w:ascii="Arial" w:hAnsi="Arial"/>
+                <w:sz w:val="20"/>
+              </w:rPr>
+              <w:t>______________________________</w:t>
+            </w:r>
+          </w:p>
+          <w:p>
+            <w:pPr>
+              <w:spacing w:before="0" w:after="0" w:line="240" w:lineRule="auto"/>
+              <w:jc w:val="left"/>
+            </w:pPr>
+            <w:r>
+              <w:rPr>
+                <w:rFonts w:ascii="Arial" w:hAnsi="Arial"/>
                 <w:b/>
-                <w:sz w:val="20"/>
-                <w:szCs w:val="24"/>
+                <w:sz w:val="19"/>
               </w:rPr>
               <w:t>Coordenador do Curso</w:t>
             </w:r>
@@ -3968,70 +3835,37 @@
         <w:tc>
           <w:tcPr>
             <w:tcW w:w="5398" w:type="dxa"/>
+            <w:vAlign w:val="center"/>
+            <w:tcMar>
+              <w:top w:w="120" w:type="dxa"/>
+              <w:start w:w="120" w:type="dxa"/>
+              <w:bottom w:w="120" w:type="dxa"/>
+              <w:end w:w="120" w:type="dxa"/>
+            </w:tcMar>
           </w:tcPr>
-          <w:p ns2:paraId="3C44F714" ns2:textId="77777777">
+          <w:p>
             <w:pPr>
-              <w:tabs>
-                <w:tab w:val="left" w:pos="0"/>
-                <w:tab w:val="left" w:pos="9639"/>
-              </w:tabs>
-              <w:spacing w:before="0" w:after="0" w:line="240" w:lineRule="auto"/>
-              <w:rPr>
-                <w:rFonts w:ascii="Arial" w:hAnsi="Arial" w:cs="Arial"/>
-                <w:sz w:val="24"/>
-                <w:szCs w:val="24"/>
-              </w:rPr>
-            </w:pPr>
-          </w:p>
-          <w:p ns2:paraId="3CC78A5D" ns2:textId="77777777">
-            <w:pPr>
-              <w:spacing w:before="0" w:after="0" w:line="240" w:lineRule="auto"/>
-              <w:rPr>
-                <w:rFonts w:ascii="Arial" w:hAnsi="Arial" w:cs="Arial"/>
-                <w:sz w:val="24"/>
-                <w:szCs w:val="24"/>
-              </w:rPr>
-            </w:pPr>
-          </w:p>
-          <w:p ns2:paraId="4E13F24B" ns2:textId="77777777">
-            <w:pPr>
-              <w:spacing w:before="0" w:after="0" w:line="240" w:lineRule="auto"/>
-              <w:rPr>
-                <w:rFonts w:ascii="Arial" w:hAnsi="Arial" w:cs="Arial"/>
-                <w:sz w:val="24"/>
-                <w:szCs w:val="24"/>
-              </w:rPr>
-            </w:pPr>
-          </w:p>
-          <w:p ns2:paraId="6E42FF49" ns2:textId="77777777">
-            <w:pPr>
-              <w:spacing w:before="0" w:after="0" w:line="240" w:lineRule="auto"/>
-              <w:rPr>
-                <w:rFonts w:ascii="Arial" w:hAnsi="Arial" w:cs="Arial"/>
-                <w:sz w:val="24"/>
-                <w:szCs w:val="24"/>
-              </w:rPr>
-            </w:pPr>
-          </w:p>
-          <w:p ns2:paraId="1B487DC5" ns2:textId="77777777">
-            <w:pPr>
-              <w:tabs>
-                <w:tab w:val="left" w:pos="0"/>
-              </w:tabs>
-              <w:spacing w:before="0" w:after="0" w:line="240" w:lineRule="auto"/>
-              <w:rPr>
-                <w:rFonts w:ascii="Arial" w:hAnsi="Arial" w:cs="Arial"/>
-                <w:b/>
-                <w:sz w:val="24"/>
-                <w:szCs w:val="24"/>
-              </w:rPr>
+              <w:spacing w:before="0" w:after="40" w:line="240" w:lineRule="auto"/>
+              <w:jc w:val="left"/>
             </w:pPr>
             <w:r>
               <w:rPr>
-                <w:rFonts w:ascii="Arial" w:hAnsi="Arial" w:cs="Arial"/>
+                <w:rFonts w:ascii="Arial" w:hAnsi="Arial"/>
+                <w:sz w:val="20"/>
+              </w:rPr>
+              <w:t>______________________________</w:t>
+            </w:r>
+          </w:p>
+          <w:p>
+            <w:pPr>
+              <w:spacing w:before="0" w:after="0" w:line="240" w:lineRule="auto"/>
+              <w:jc w:val="left"/>
+            </w:pPr>
+            <w:r>
+              <w:rPr>
+                <w:rFonts w:ascii="Arial" w:hAnsi="Arial"/>
                 <w:b/>
-                <w:sz w:val="20"/>
-                <w:szCs w:val="24"/>
+                <w:sz w:val="19"/>
               </w:rPr>
               <w:t>Representante Legal (Quando menor)</w:t>
             </w:r>
@@ -4041,74 +3875,42 @@
       <w:tr ns2:paraId="487C4949" ns2:textId="77777777">
         <w:trPr>
           <w:trHeight w:val="1510"/>
+          <w:cantSplit/>
         </w:trPr>
         <w:tc>
           <w:tcPr>
             <w:tcW w:w="5398" w:type="dxa"/>
+            <w:vAlign w:val="center"/>
+            <w:tcMar>
+              <w:top w:w="120" w:type="dxa"/>
+              <w:start w:w="120" w:type="dxa"/>
+              <w:bottom w:w="120" w:type="dxa"/>
+              <w:end w:w="120" w:type="dxa"/>
+            </w:tcMar>
           </w:tcPr>
-          <w:p ns2:paraId="7455ABE7" ns2:textId="77777777">
+          <w:p>
             <w:pPr>
-              <w:tabs>
-                <w:tab w:val="left" w:pos="0"/>
-                <w:tab w:val="left" w:pos="9639"/>
-              </w:tabs>
-              <w:spacing w:before="0" w:after="0" w:line="240" w:lineRule="auto"/>
-              <w:rPr>
-                <w:rFonts w:ascii="Arial" w:hAnsi="Arial" w:cs="Arial"/>
-                <w:sz w:val="24"/>
-                <w:szCs w:val="24"/>
-              </w:rPr>
-            </w:pPr>
-          </w:p>
-          <w:p ns2:paraId="15B0AE96" ns2:textId="77777777">
-            <w:pPr>
-              <w:spacing w:before="0" w:after="0" w:line="240" w:lineRule="auto"/>
-              <w:rPr>
-                <w:rFonts w:ascii="Arial" w:hAnsi="Arial" w:cs="Arial"/>
-                <w:sz w:val="24"/>
-                <w:szCs w:val="24"/>
-              </w:rPr>
-            </w:pPr>
-          </w:p>
-          <w:p ns2:paraId="36267919" ns2:textId="77777777">
-            <w:pPr>
-              <w:spacing w:before="0" w:after="0" w:line="240" w:lineRule="auto"/>
-              <w:rPr>
-                <w:rFonts w:ascii="Arial" w:hAnsi="Arial" w:cs="Arial"/>
-                <w:sz w:val="24"/>
-                <w:szCs w:val="24"/>
-              </w:rPr>
-            </w:pPr>
-          </w:p>
-          <w:p ns2:paraId="7D008E4B" ns2:textId="77777777">
-            <w:pPr>
-              <w:spacing w:before="0" w:after="0" w:line="240" w:lineRule="auto"/>
-              <w:rPr>
-                <w:rFonts w:ascii="Arial" w:hAnsi="Arial" w:cs="Arial"/>
-                <w:sz w:val="24"/>
-                <w:szCs w:val="24"/>
-              </w:rPr>
-            </w:pPr>
-          </w:p>
-          <w:p ns2:paraId="195FC7C3" ns2:textId="77777777">
-            <w:pPr>
-              <w:tabs>
-                <w:tab w:val="left" w:pos="0"/>
-              </w:tabs>
-              <w:spacing w:line="240" w:lineRule="auto" w:before="0" w:after="0"/>
-              <w:rPr>
-                <w:rFonts w:ascii="Arial" w:hAnsi="Arial" w:cs="Arial"/>
-                <w:b/>
-                <w:sz w:val="24"/>
-                <w:szCs w:val="24"/>
-              </w:rPr>
+              <w:spacing w:before="0" w:after="40" w:line="240" w:lineRule="auto"/>
+              <w:jc w:val="left"/>
             </w:pPr>
             <w:r>
               <w:rPr>
-                <w:rFonts w:ascii="Arial" w:hAnsi="Arial" w:cs="Arial"/>
+                <w:rFonts w:ascii="Arial" w:hAnsi="Arial"/>
+                <w:sz w:val="20"/>
+              </w:rPr>
+              <w:t>______________________________</w:t>
+            </w:r>
+          </w:p>
+          <w:p>
+            <w:pPr>
+              <w:spacing w:before="0" w:after="0" w:line="240" w:lineRule="auto"/>
+              <w:jc w:val="left"/>
+            </w:pPr>
+            <w:r>
+              <w:rPr>
+                <w:rFonts w:ascii="Arial" w:hAnsi="Arial"/>
                 <w:b/>
-                <w:sz w:val="20"/>
-                <w:szCs w:val="24"/>
+                <w:sz w:val="19"/>
               </w:rPr>
               <w:t>Secretaria Acadêmica da AEMS</w:t>
             </w:r>
@@ -4117,81 +3919,39 @@
         <w:tc>
           <w:tcPr>
             <w:tcW w:w="5398" w:type="dxa"/>
+            <w:vAlign w:val="center"/>
+            <w:tcMar>
+              <w:top w:w="120" w:type="dxa"/>
+              <w:start w:w="120" w:type="dxa"/>
+              <w:bottom w:w="120" w:type="dxa"/>
+              <w:end w:w="120" w:type="dxa"/>
+            </w:tcMar>
           </w:tcPr>
-          <w:p ns2:paraId="0A7F48B4" ns2:textId="77777777">
+          <w:p>
             <w:pPr>
-              <w:tabs>
-                <w:tab w:val="left" w:pos="0"/>
-                <w:tab w:val="left" w:pos="9639"/>
-              </w:tabs>
-              <w:spacing w:before="0" w:after="0" w:line="240" w:lineRule="auto"/>
-              <w:rPr>
-                <w:rFonts w:ascii="Arial" w:hAnsi="Arial" w:cs="Arial"/>
-                <w:sz w:val="24"/>
-                <w:szCs w:val="24"/>
-              </w:rPr>
-            </w:pPr>
-          </w:p>
-          <w:p ns2:paraId="5014D218" ns2:textId="77777777">
-            <w:pPr>
-              <w:spacing w:before="0" w:after="0" w:line="240" w:lineRule="auto"/>
-              <w:rPr>
-                <w:rFonts w:ascii="Arial" w:hAnsi="Arial" w:cs="Arial"/>
-                <w:sz w:val="24"/>
-                <w:szCs w:val="24"/>
-              </w:rPr>
-            </w:pPr>
-          </w:p>
-          <w:p ns2:paraId="49CCBF1B" ns2:textId="77777777">
-            <w:pPr>
-              <w:spacing w:before="0" w:after="0" w:line="240" w:lineRule="auto"/>
-              <w:rPr>
-                <w:rFonts w:ascii="Arial" w:hAnsi="Arial" w:cs="Arial"/>
-                <w:sz w:val="24"/>
-                <w:szCs w:val="24"/>
-              </w:rPr>
-            </w:pPr>
-          </w:p>
-          <w:p ns2:paraId="4ECC4739" ns2:textId="77777777">
-            <w:pPr>
-              <w:spacing w:before="0" w:after="0" w:line="240" w:lineRule="auto"/>
-              <w:rPr>
-                <w:rFonts w:ascii="Arial" w:hAnsi="Arial" w:cs="Arial"/>
-                <w:sz w:val="24"/>
-                <w:szCs w:val="24"/>
-              </w:rPr>
-            </w:pPr>
-          </w:p>
-          <w:p ns2:paraId="0DD53C70" ns2:textId="77777777">
-            <w:pPr>
-              <w:tabs>
-                <w:tab w:val="left" w:pos="0"/>
-              </w:tabs>
-              <w:spacing w:line="240" w:lineRule="auto" w:before="0" w:after="0"/>
-              <w:rPr>
-                <w:rFonts w:ascii="Arial" w:hAnsi="Arial" w:cs="Arial"/>
-                <w:b/>
-                <w:sz w:val="24"/>
-                <w:szCs w:val="24"/>
-              </w:rPr>
+              <w:spacing w:before="0" w:after="40" w:line="240" w:lineRule="auto"/>
+              <w:jc w:val="left"/>
             </w:pPr>
             <w:r>
               <w:rPr>
-                <w:rFonts w:ascii="Arial" w:hAnsi="Arial" w:cs="Arial"/>
-                <w:b/>
+                <w:rFonts w:ascii="Arial" w:hAnsi="Arial"/>
                 <w:sz w:val="20"/>
-                <w:szCs w:val="24"/>
               </w:rPr>
-              <w:t>Testemunha</w:t>
+              <w:t>______________________________</w:t>
             </w:r>
+          </w:p>
+          <w:p>
+            <w:pPr>
+              <w:spacing w:before="0" w:after="0" w:line="240" w:lineRule="auto"/>
+              <w:jc w:val="left"/>
+            </w:pPr>
             <w:r>
               <w:rPr>
-                <w:rFonts w:ascii="Arial" w:hAnsi="Arial" w:cs="Arial"/>
+                <w:rFonts w:ascii="Arial" w:hAnsi="Arial"/>
                 <w:b/>
-                <w:sz w:val="20"/>
-                <w:szCs w:val="24"/>
+                <w:sz w:val="19"/>
               </w:rPr>
-              <w:t>s</w:t>
+              <w:t>Testemunhas</w:t>
             </w:r>
           </w:p>
         </w:tc>

</xml_diff>

<commit_message>
Remove caixas do quadro de assinaturas
</commit_message>
<xml_diff>
--- a/models/termo-compromisso-estagio-obrigatorio-aems.docx
+++ b/models/termo-compromisso-estagio-obrigatorio-aems.docx
@@ -3699,6 +3699,14 @@
         <w:tblStyle w:val="Tabelacomgrade"/>
         <w:tblW w:w="10796" w:type="dxa"/>
         <w:tblLook w:val="04A0" w:firstRow="1" w:lastRow="0" w:firstColumn="1" w:lastColumn="0" w:noHBand="0" w:noVBand="1"/>
+        <w:tblBorders>
+          <w:top w:val="nil"/>
+          <w:left w:val="nil"/>
+          <w:bottom w:val="nil"/>
+          <w:right w:val="nil"/>
+          <w:insideH w:val="nil"/>
+          <w:insideV w:val="nil"/>
+        </w:tblBorders>
       </w:tblPr>
       <w:tblGrid>
         <w:gridCol w:w="5398"/>
@@ -3719,6 +3727,14 @@
               <w:bottom w:w="120" w:type="dxa"/>
               <w:end w:w="120" w:type="dxa"/>
             </w:tcMar>
+            <w:tcBorders>
+              <w:top w:val="nil"/>
+              <w:left w:val="nil"/>
+              <w:bottom w:val="nil"/>
+              <w:right w:val="nil"/>
+              <w:insideH w:val="nil"/>
+              <w:insideV w:val="nil"/>
+            </w:tcBorders>
           </w:tcPr>
           <w:p>
             <w:pPr>
@@ -3758,6 +3774,14 @@
               <w:bottom w:w="120" w:type="dxa"/>
               <w:end w:w="120" w:type="dxa"/>
             </w:tcMar>
+            <w:tcBorders>
+              <w:top w:val="nil"/>
+              <w:left w:val="nil"/>
+              <w:bottom w:val="nil"/>
+              <w:right w:val="nil"/>
+              <w:insideH w:val="nil"/>
+              <w:insideV w:val="nil"/>
+            </w:tcBorders>
           </w:tcPr>
           <w:p>
             <w:pPr>
@@ -3803,6 +3827,14 @@
               <w:bottom w:w="120" w:type="dxa"/>
               <w:end w:w="120" w:type="dxa"/>
             </w:tcMar>
+            <w:tcBorders>
+              <w:top w:val="nil"/>
+              <w:left w:val="nil"/>
+              <w:bottom w:val="nil"/>
+              <w:right w:val="nil"/>
+              <w:insideH w:val="nil"/>
+              <w:insideV w:val="nil"/>
+            </w:tcBorders>
           </w:tcPr>
           <w:p>
             <w:pPr>
@@ -3842,6 +3874,14 @@
               <w:bottom w:w="120" w:type="dxa"/>
               <w:end w:w="120" w:type="dxa"/>
             </w:tcMar>
+            <w:tcBorders>
+              <w:top w:val="nil"/>
+              <w:left w:val="nil"/>
+              <w:bottom w:val="nil"/>
+              <w:right w:val="nil"/>
+              <w:insideH w:val="nil"/>
+              <w:insideV w:val="nil"/>
+            </w:tcBorders>
           </w:tcPr>
           <w:p>
             <w:pPr>
@@ -3887,6 +3927,14 @@
               <w:bottom w:w="120" w:type="dxa"/>
               <w:end w:w="120" w:type="dxa"/>
             </w:tcMar>
+            <w:tcBorders>
+              <w:top w:val="nil"/>
+              <w:left w:val="nil"/>
+              <w:bottom w:val="nil"/>
+              <w:right w:val="nil"/>
+              <w:insideH w:val="nil"/>
+              <w:insideV w:val="nil"/>
+            </w:tcBorders>
           </w:tcPr>
           <w:p>
             <w:pPr>
@@ -3926,6 +3974,14 @@
               <w:bottom w:w="120" w:type="dxa"/>
               <w:end w:w="120" w:type="dxa"/>
             </w:tcMar>
+            <w:tcBorders>
+              <w:top w:val="nil"/>
+              <w:left w:val="nil"/>
+              <w:bottom w:val="nil"/>
+              <w:right w:val="nil"/>
+              <w:insideH w:val="nil"/>
+              <w:insideV w:val="nil"/>
+            </w:tcBorders>
           </w:tcPr>
           <w:p>
             <w:pPr>

</xml_diff>